<commit_message>
updated version - 7th November
</commit_message>
<xml_diff>
--- a/Kafka_learning.docx
+++ b/Kafka_learning.docx
@@ -1021,6 +1021,11 @@
                 <w:rStyle w:val="IndexLink"/>
               </w:rPr>
               <w:t>Overview</w:t>
+            </w:r>
+            <w:r>
+              <w:rPr>
+                <w:rStyle w:val="IndexLink"/>
+              </w:rPr>
               <w:tab/>
               <w:t>2</w:t>
             </w:r>
@@ -6511,6 +6516,7 @@
       <w:r>
         <w:rPr>
           <w:rStyle w:val="SourceText"/>
+          <w:rFonts w:ascii="Liberation Serif" w:hAnsi="Liberation Serif"/>
         </w:rPr>
         <w:t>Finding and Stopping Kafka Processes on Port 9092</w:t>
       </w:r>
@@ -6724,7 +6730,7 @@
       <w:r>
         <w:rPr>
           <w:rStyle w:val="SourceText"/>
-          <w:rFonts w:eastAsia="Noto Sans CJK SC" w:cs="FreeSans"/>
+          <w:rFonts w:eastAsia="Noto Sans CJK SC" w:cs="FreeSans" w:ascii="Liberation Serif" w:hAnsi="Liberation Serif"/>
           <w:color w:val="auto"/>
           <w:kern w:val="2"/>
           <w:lang w:val="en-IN" w:eastAsia="zh-CN" w:bidi="hi-IN"/>
@@ -7308,28 +7314,7 @@
         <w:br/>
         <w:t xml:space="preserve"># the brokers. </w:t>
         <w:br/>
-      </w:r>
-      <w:r>
-        <w:rPr>
-          <w:rFonts w:eastAsia="Noto Serif CJK SC" w:cs="FreeSans" w:ascii="FreeMono" w:hAnsi="FreeMono"/>
-          <w:color w:val="auto"/>
-          <w:kern w:val="2"/>
-          <w:sz w:val="24"/>
-          <w:szCs w:val="24"/>
-          <w:lang w:val="en-IN" w:eastAsia="zh-CN" w:bidi="hi-IN"/>
-        </w:rPr>
-        <w:t xml:space="preserve"># </w:t>
-      </w:r>
-      <w:r>
-        <w:rPr>
-          <w:rFonts w:eastAsia="Noto Serif CJK SC" w:cs="FreeSans" w:ascii="FreeMono" w:hAnsi="FreeMono"/>
-          <w:color w:val="auto"/>
-          <w:kern w:val="2"/>
-          <w:sz w:val="24"/>
-          <w:szCs w:val="24"/>
-          <w:lang w:val="en-IN" w:eastAsia="zh-CN" w:bidi="hi-IN"/>
-        </w:rPr>
-        <w:t>num.partitions=1</w:t>
+        <w:t># num.partitions=1</w:t>
       </w:r>
     </w:p>
     <w:p>
@@ -7497,7 +7482,6 @@
     <w:p>
       <w:pPr>
         <w:pStyle w:val="BodyText"/>
-        <w:pBdr/>
         <w:ind w:hanging="0" w:start="1418" w:end="0"/>
         <w:rPr/>
       </w:pPr>
@@ -7524,7 +7508,6 @@
     <w:p>
       <w:pPr>
         <w:pStyle w:val="BodyText"/>
-        <w:pBdr/>
         <w:ind w:hanging="0" w:start="1418" w:end="0"/>
         <w:rPr/>
       </w:pPr>
@@ -7551,7 +7534,6 @@
     <w:p>
       <w:pPr>
         <w:pStyle w:val="BodyText"/>
-        <w:pBdr/>
         <w:ind w:hanging="0" w:start="1418" w:end="0"/>
         <w:rPr/>
       </w:pPr>
@@ -7606,7 +7588,6 @@
     <w:p>
       <w:pPr>
         <w:pStyle w:val="BodyText"/>
-        <w:pBdr/>
         <w:ind w:hanging="0" w:start="1418" w:end="0"/>
         <w:rPr/>
       </w:pPr>
@@ -7702,7 +7683,6 @@
     <w:p>
       <w:pPr>
         <w:pStyle w:val="BodyText"/>
-        <w:pBdr/>
         <w:ind w:hanging="0" w:start="1418" w:end="0"/>
         <w:rPr/>
       </w:pPr>
@@ -7743,6 +7723,7 @@
       <w:r>
         <w:rPr>
           <w:rStyle w:val="SourceText"/>
+          <w:rFonts w:ascii="Liberation Serif" w:hAnsi="Liberation Serif"/>
         </w:rPr>
         <w:t>Listing All Kafka Topics</w:t>
       </w:r>
@@ -8049,7 +8030,7 @@
       <w:r>
         <w:rPr>
           <w:rStyle w:val="SourceText"/>
-          <w:rFonts w:eastAsia="Noto Sans CJK SC" w:cs="FreeSans"/>
+          <w:rFonts w:eastAsia="Noto Sans CJK SC" w:cs="FreeSans" w:ascii="Liberation Serif" w:hAnsi="Liberation Serif"/>
           <w:color w:val="auto"/>
           <w:kern w:val="2"/>
           <w:lang w:val="en-IN" w:eastAsia="zh-CN" w:bidi="hi-IN"/>
@@ -8208,7 +8189,7 @@
           <w:rStyle w:val="Hyperlink"/>
           <w:u w:val="none"/>
           <w:kern w:val="2"/>
-          <w:rFonts w:ascii="Liberation Mono" w:hAnsi="Liberation Mono" w:eastAsia="Noto Sans CJK SC" w:cs="FreeSans"/>
+          <w:rFonts w:eastAsia="Noto Sans CJK SC" w:cs="FreeSans" w:ascii="Liberation Serif" w:hAnsi="Liberation Serif"/>
           <w:color w:val="auto"/>
           <w:lang w:val="en-IN" w:eastAsia="zh-CN" w:bidi="hi-IN"/>
         </w:rPr>
@@ -8219,7 +8200,7 @@
           <w:rStyle w:val="Hyperlink"/>
           <w:u w:val="none"/>
           <w:kern w:val="2"/>
-          <w:rFonts w:ascii="Liberation Mono" w:hAnsi="Liberation Mono" w:eastAsia="Noto Sans CJK SC" w:cs="FreeSans"/>
+          <w:rFonts w:eastAsia="Noto Sans CJK SC" w:cs="FreeSans" w:ascii="Liberation Serif" w:hAnsi="Liberation Serif"/>
           <w:color w:val="auto"/>
           <w:lang w:val="en-IN" w:eastAsia="zh-CN" w:bidi="hi-IN"/>
         </w:rPr>
@@ -8230,7 +8211,7 @@
       <w:r>
         <w:rPr>
           <w:rStyle w:val="Hyperlink"/>
-          <w:rFonts w:ascii="Liberation Mono" w:hAnsi="Liberation Mono" w:eastAsia="Noto Sans CJK SC" w:cs="FreeSans"/>
+          <w:rFonts w:eastAsia="Noto Sans CJK SC" w:cs="FreeSans" w:ascii="Liberation Serif" w:hAnsi="Liberation Serif"/>
           <w:color w:val="auto"/>
           <w:kern w:val="2"/>
           <w:u w:val="none"/>
@@ -8243,7 +8224,7 @@
           <w:rStyle w:val="Hyperlink"/>
           <w:u w:val="none"/>
           <w:kern w:val="2"/>
-          <w:rFonts w:ascii="Liberation Mono" w:hAnsi="Liberation Mono" w:eastAsia="Noto Sans CJK SC" w:cs="FreeSans"/>
+          <w:rFonts w:eastAsia="Noto Sans CJK SC" w:cs="FreeSans" w:ascii="Liberation Serif" w:hAnsi="Liberation Serif"/>
           <w:color w:val="auto"/>
           <w:lang w:val="en-IN" w:eastAsia="zh-CN" w:bidi="hi-IN"/>
         </w:rPr>
@@ -8575,7 +8556,7 @@
           <w:rStyle w:val="Hyperlink"/>
           <w:u w:val="none"/>
           <w:kern w:val="2"/>
-          <w:rFonts w:eastAsia="Noto Sans CJK SC" w:cs="FreeSans" w:ascii="Liberation Sans" w:hAnsi="Liberation Sans"/>
+          <w:rFonts w:eastAsia="Noto Sans CJK SC" w:cs="FreeSans" w:ascii="Liberation Serif" w:hAnsi="Liberation Serif"/>
           <w:color w:val="auto"/>
           <w:lang w:val="en-IN" w:eastAsia="zh-CN" w:bidi="hi-IN"/>
         </w:rPr>
@@ -8586,7 +8567,7 @@
           <w:rStyle w:val="Hyperlink"/>
           <w:u w:val="none"/>
           <w:kern w:val="2"/>
-          <w:rFonts w:eastAsia="Noto Sans CJK SC" w:cs="FreeSans" w:ascii="Liberation Sans" w:hAnsi="Liberation Sans"/>
+          <w:rFonts w:eastAsia="Noto Sans CJK SC" w:cs="FreeSans" w:ascii="Liberation Serif" w:hAnsi="Liberation Serif"/>
           <w:color w:val="auto"/>
           <w:lang w:val="en-IN" w:eastAsia="zh-CN" w:bidi="hi-IN"/>
         </w:rPr>
@@ -8597,7 +8578,7 @@
       <w:r>
         <w:rPr>
           <w:rStyle w:val="Hyperlink"/>
-          <w:rFonts w:eastAsia="Noto Sans CJK SC" w:cs="FreeSans" w:ascii="Liberation Sans" w:hAnsi="Liberation Sans"/>
+          <w:rFonts w:eastAsia="Noto Sans CJK SC" w:cs="FreeSans" w:ascii="Liberation Serif" w:hAnsi="Liberation Serif"/>
           <w:color w:val="auto"/>
           <w:kern w:val="2"/>
           <w:u w:val="none"/>
@@ -8610,7 +8591,7 @@
           <w:rStyle w:val="Hyperlink"/>
           <w:u w:val="none"/>
           <w:kern w:val="2"/>
-          <w:rFonts w:eastAsia="Noto Sans CJK SC" w:cs="FreeSans" w:ascii="Liberation Sans" w:hAnsi="Liberation Sans"/>
+          <w:rFonts w:eastAsia="Noto Sans CJK SC" w:cs="FreeSans" w:ascii="Liberation Serif" w:hAnsi="Liberation Serif"/>
           <w:color w:val="auto"/>
           <w:lang w:val="en-IN" w:eastAsia="zh-CN" w:bidi="hi-IN"/>
         </w:rPr>
@@ -9128,7 +9109,19 @@
         </w:rPr>
       </w:pPr>
       <w:r>
-        <w:rPr/>
+        <w:rPr>
+          <w:rFonts w:eastAsia="Noto Serif CJK SC" w:cs="FreeSans" w:ascii="Liberation Sans" w:hAnsi="Liberation Sans"/>
+          <w:b w:val="false"/>
+          <w:i w:val="false"/>
+          <w:caps w:val="false"/>
+          <w:smallCaps w:val="false"/>
+          <w:color w:val="000000"/>
+          <w:spacing w:val="0"/>
+          <w:kern w:val="2"/>
+          <w:sz w:val="24"/>
+          <w:szCs w:val="24"/>
+          <w:lang w:val="en-IN" w:eastAsia="zh-CN" w:bidi="hi-IN"/>
+        </w:rPr>
       </w:r>
     </w:p>
     <w:p>
@@ -9154,7 +9147,7 @@
           <w:rStyle w:val="Hyperlink"/>
           <w:u w:val="none"/>
           <w:kern w:val="2"/>
-          <w:rFonts w:eastAsia="Noto Sans CJK SC" w:cs="FreeSans" w:ascii="Liberation Sans" w:hAnsi="Liberation Sans"/>
+          <w:rFonts w:eastAsia="Noto Sans CJK SC" w:cs="FreeSans" w:ascii="Liberation Serif" w:hAnsi="Liberation Serif"/>
           <w:color w:val="auto"/>
           <w:lang w:val="en-IN" w:eastAsia="zh-CN" w:bidi="hi-IN"/>
         </w:rPr>
@@ -9165,7 +9158,7 @@
           <w:rStyle w:val="Hyperlink"/>
           <w:u w:val="none"/>
           <w:kern w:val="2"/>
-          <w:rFonts w:eastAsia="Noto Sans CJK SC" w:cs="FreeSans" w:ascii="Liberation Sans" w:hAnsi="Liberation Sans"/>
+          <w:rFonts w:eastAsia="Noto Sans CJK SC" w:cs="FreeSans" w:ascii="Liberation Serif" w:hAnsi="Liberation Serif"/>
           <w:color w:val="auto"/>
           <w:lang w:val="en-IN" w:eastAsia="zh-CN" w:bidi="hi-IN"/>
         </w:rPr>
@@ -9176,7 +9169,7 @@
       <w:r>
         <w:rPr>
           <w:rStyle w:val="Hyperlink"/>
-          <w:rFonts w:eastAsia="Noto Sans CJK SC" w:cs="FreeSans" w:ascii="Liberation Sans" w:hAnsi="Liberation Sans"/>
+          <w:rFonts w:eastAsia="Noto Sans CJK SC" w:cs="FreeSans" w:ascii="Liberation Serif" w:hAnsi="Liberation Serif"/>
           <w:color w:val="auto"/>
           <w:kern w:val="2"/>
           <w:u w:val="none"/>
@@ -9189,7 +9182,7 @@
           <w:rStyle w:val="Hyperlink"/>
           <w:u w:val="none"/>
           <w:kern w:val="2"/>
-          <w:rFonts w:eastAsia="Noto Sans CJK SC" w:cs="FreeSans" w:ascii="Liberation Sans" w:hAnsi="Liberation Sans"/>
+          <w:rFonts w:eastAsia="Noto Sans CJK SC" w:cs="FreeSans" w:ascii="Liberation Serif" w:hAnsi="Liberation Serif"/>
           <w:color w:val="auto"/>
           <w:lang w:val="en-IN" w:eastAsia="zh-CN" w:bidi="hi-IN"/>
         </w:rPr>
@@ -9594,7 +9587,7 @@
       <w:r>
         <w:rPr>
           <w:rStyle w:val="SourceText"/>
-          <w:rFonts w:eastAsia="Noto Sans CJK SC" w:cs="FreeSans"/>
+          <w:rFonts w:eastAsia="Noto Sans CJK SC" w:cs="FreeSans" w:ascii="Liberation Serif" w:hAnsi="Liberation Serif"/>
           <w:color w:val="auto"/>
           <w:kern w:val="2"/>
           <w:u w:val="none"/>
@@ -11286,8 +11279,34 @@
           <w:u w:val="none"/>
           <w:lang w:val="en-IN" w:eastAsia="zh-CN" w:bidi="hi-IN"/>
         </w:rPr>
-        <w:t>k</w:t>
-      </w:r>
+        <w:t>kafka-topics.sh</w:t>
+      </w:r>
+    </w:p>
+    <w:p>
+      <w:pPr>
+        <w:pStyle w:val="BodyText"/>
+        <w:widowControl/>
+        <w:suppressAutoHyphens w:val="true"/>
+        <w:bidi w:val="0"/>
+        <w:spacing w:lineRule="auto" w:line="276" w:before="0" w:after="140"/>
+        <w:jc w:val="start"/>
+        <w:rPr>
+          <w:rFonts w:ascii="Liberation Sans" w:hAnsi="Liberation Sans" w:eastAsia="Noto Serif CJK SC" w:cs="FreeSans"/>
+          <w:b w:val="false"/>
+          <w:bCs w:val="false"/>
+          <w:i w:val="false"/>
+          <w:i w:val="false"/>
+          <w:caps w:val="false"/>
+          <w:smallCaps w:val="false"/>
+          <w:color w:val="000000"/>
+          <w:spacing w:val="0"/>
+          <w:kern w:val="2"/>
+          <w:sz w:val="24"/>
+          <w:szCs w:val="24"/>
+          <w:u w:val="none"/>
+          <w:lang w:val="en-IN" w:eastAsia="zh-CN" w:bidi="hi-IN"/>
+        </w:rPr>
+      </w:pPr>
       <w:r>
         <w:rPr>
           <w:rStyle w:val="SourceText"/>
@@ -11305,7 +11324,7 @@
           <w:u w:val="none"/>
           <w:lang w:val="en-IN" w:eastAsia="zh-CN" w:bidi="hi-IN"/>
         </w:rPr>
-        <w:t>afka-topics.sh</w:t>
+        <w:t># LIST DOWN TOPICS</w:t>
       </w:r>
     </w:p>
     <w:p>
@@ -11350,7 +11369,7 @@
           <w:u w:val="none"/>
           <w:lang w:val="en-IN" w:eastAsia="zh-CN" w:bidi="hi-IN"/>
         </w:rPr>
-        <w:t># LIST DOWN TOPICS</w:t>
+        <w:t>kafka-topics.sh --bootstrap-server &lt;broker_address:port&gt; --list</w:t>
       </w:r>
     </w:p>
     <w:p>
@@ -11395,7 +11414,7 @@
           <w:u w:val="none"/>
           <w:lang w:val="en-IN" w:eastAsia="zh-CN" w:bidi="hi-IN"/>
         </w:rPr>
-        <w:t>kafka-topics.sh --list --bootstrap-server &lt;broker_address:port&gt;</w:t>
+        <w:t># CREATE A TOPIC</w:t>
       </w:r>
     </w:p>
     <w:p>
@@ -11440,7 +11459,7 @@
           <w:u w:val="none"/>
           <w:lang w:val="en-IN" w:eastAsia="zh-CN" w:bidi="hi-IN"/>
         </w:rPr>
-        <w:t># CREATE A TOPIC</w:t>
+        <w:t>kafka-topics.sh --bootstrap-server &lt;broker_address:port&gt; --create --topic &lt;topic_name&gt;</w:t>
       </w:r>
     </w:p>
     <w:p>
@@ -11485,7 +11504,7 @@
           <w:u w:val="none"/>
           <w:lang w:val="en-IN" w:eastAsia="zh-CN" w:bidi="hi-IN"/>
         </w:rPr>
-        <w:t>kafka-topics.sh --create --topic &lt;topic_name&gt; --bootstrap-server &lt;broker_address:port&gt;</w:t>
+        <w:t># CREATE A TOPIC WITH PARTITIONS CONFIGURATION</w:t>
       </w:r>
     </w:p>
     <w:p>
@@ -11530,7 +11549,7 @@
           <w:u w:val="none"/>
           <w:lang w:val="en-IN" w:eastAsia="zh-CN" w:bidi="hi-IN"/>
         </w:rPr>
-        <w:t># CREATE A TOPIC WITH PARTITIONS CONFIGURATION</w:t>
+        <w:t>kafka-topics.sh --bootstrap-server &lt;broker_address:port&gt; --create --topic &lt;topic_name&gt; --partitions &lt;desired_partition_number&gt;</w:t>
       </w:r>
     </w:p>
     <w:p>
@@ -11575,7 +11594,7 @@
           <w:u w:val="none"/>
           <w:lang w:val="en-IN" w:eastAsia="zh-CN" w:bidi="hi-IN"/>
         </w:rPr>
-        <w:t>kafka-topics.sh --create --topic &lt;topic_name&gt; --partitions &lt;desired_partition_number&gt; --bootstrap-server &lt;broker_address:port&gt;</w:t>
+        <w:t># CREATE A TOPIC WITH PARTITIONS &amp; REPLICATION CONFIGURATIONS</w:t>
       </w:r>
     </w:p>
     <w:p>
@@ -11620,7 +11639,7 @@
           <w:u w:val="none"/>
           <w:lang w:val="en-IN" w:eastAsia="zh-CN" w:bidi="hi-IN"/>
         </w:rPr>
-        <w:t># CREATE A TOPIC WITH PARTITIONS &amp; REPLICATION CONFIGURATIONS</w:t>
+        <w:t xml:space="preserve">kafka-topics.sh --bootstrap-server &lt;broker_address:port&gt; --create --topic &lt;topic_name&gt; --partitions &lt;desired_partition_number&gt; --replication-factor &lt;desired_replication_factor&gt; </w:t>
       </w:r>
     </w:p>
     <w:p>
@@ -11665,8 +11684,18 @@
           <w:u w:val="none"/>
           <w:lang w:val="en-IN" w:eastAsia="zh-CN" w:bidi="hi-IN"/>
         </w:rPr>
-        <w:t>kafka-topics.sh --create --topic &lt;topic_name&gt; --partitions &lt;desired_partition_number&gt; --</w:t>
-      </w:r>
+        <w:t># CREATE A TOPIC WITH KEY:VALUE CONFIGURATION</w:t>
+      </w:r>
+    </w:p>
+    <w:p>
+      <w:pPr>
+        <w:pStyle w:val="BodyText"/>
+        <w:widowControl/>
+        <w:suppressAutoHyphens w:val="true"/>
+        <w:bidi w:val="0"/>
+        <w:jc w:val="start"/>
+        <w:rPr/>
+      </w:pPr>
       <w:r>
         <w:rPr>
           <w:rStyle w:val="SourceText"/>
@@ -11684,8 +11713,18 @@
           <w:u w:val="none"/>
           <w:lang w:val="en-IN" w:eastAsia="zh-CN" w:bidi="hi-IN"/>
         </w:rPr>
-        <w:t xml:space="preserve">replication-factor &lt;desired_replication_factor&gt; </w:t>
-      </w:r>
+        <w:t>kafka-console-producer.sh --bootstrap-server &lt;broker_address:port&gt; --topic &lt;topic_name&gt; --property parse.key=true --property key.separator=&lt;separator_symbol&gt;</w:t>
+      </w:r>
+    </w:p>
+    <w:p>
+      <w:pPr>
+        <w:pStyle w:val="BodyText"/>
+        <w:widowControl/>
+        <w:suppressAutoHyphens w:val="true"/>
+        <w:bidi w:val="0"/>
+        <w:jc w:val="start"/>
+        <w:rPr/>
+      </w:pPr>
       <w:r>
         <w:rPr>
           <w:rStyle w:val="SourceText"/>
@@ -11703,7 +11742,65 @@
           <w:u w:val="none"/>
           <w:lang w:val="en-IN" w:eastAsia="zh-CN" w:bidi="hi-IN"/>
         </w:rPr>
-        <w:t>--bootstrap-server &lt;broker_address:port&gt;</w:t>
+        <w:t xml:space="preserve">Example - kafka-console-producer.sh --bootstrap-server localhost:9092 --topic first_topic --property parse.key=true --property key.separator=: </w:t>
+      </w:r>
+    </w:p>
+    <w:p>
+      <w:pPr>
+        <w:pStyle w:val="BodyText"/>
+        <w:widowControl/>
+        <w:suppressAutoHyphens w:val="true"/>
+        <w:bidi w:val="0"/>
+        <w:jc w:val="start"/>
+        <w:rPr/>
+      </w:pPr>
+      <w:r>
+        <w:rPr>
+          <w:rStyle w:val="SourceText"/>
+          <w:rFonts w:eastAsia="Noto Serif CJK SC" w:cs="FreeSans" w:ascii="FreeMono" w:hAnsi="FreeMono"/>
+          <w:b w:val="false"/>
+          <w:bCs w:val="false"/>
+          <w:i w:val="false"/>
+          <w:caps w:val="false"/>
+          <w:smallCaps w:val="false"/>
+          <w:color w:val="000000"/>
+          <w:spacing w:val="0"/>
+          <w:kern w:val="2"/>
+          <w:sz w:val="24"/>
+          <w:szCs w:val="24"/>
+          <w:u w:val="none"/>
+          <w:lang w:val="en-IN" w:eastAsia="zh-CN" w:bidi="hi-IN"/>
+        </w:rPr>
+        <w:t>&gt;example key:example value</w:t>
+      </w:r>
+    </w:p>
+    <w:p>
+      <w:pPr>
+        <w:pStyle w:val="BodyText"/>
+        <w:widowControl/>
+        <w:suppressAutoHyphens w:val="true"/>
+        <w:bidi w:val="0"/>
+        <w:jc w:val="start"/>
+        <w:rPr/>
+      </w:pPr>
+      <w:r>
+        <w:rPr>
+          <w:rStyle w:val="SourceText"/>
+          <w:rFonts w:eastAsia="Noto Serif CJK SC" w:cs="FreeSans" w:ascii="FreeMono" w:hAnsi="FreeMono"/>
+          <w:b w:val="false"/>
+          <w:bCs w:val="false"/>
+          <w:i w:val="false"/>
+          <w:caps w:val="false"/>
+          <w:smallCaps w:val="false"/>
+          <w:color w:val="000000"/>
+          <w:spacing w:val="0"/>
+          <w:kern w:val="2"/>
+          <w:sz w:val="24"/>
+          <w:szCs w:val="24"/>
+          <w:u w:val="none"/>
+          <w:lang w:val="en-IN" w:eastAsia="zh-CN" w:bidi="hi-IN"/>
+        </w:rPr>
+        <w:t>&gt;name:Stephane</w:t>
       </w:r>
     </w:p>
     <w:p>
@@ -11748,17 +11845,33 @@
           <w:u w:val="none"/>
           <w:lang w:val="en-IN" w:eastAsia="zh-CN" w:bidi="hi-IN"/>
         </w:rPr>
-        <w:t># CREATE A TOPIC WITH KEY:VALUE CONFIGURATION</w:t>
-      </w:r>
-    </w:p>
-    <w:p>
-      <w:pPr>
-        <w:pStyle w:val="BodyText"/>
-        <w:widowControl/>
-        <w:suppressAutoHyphens w:val="true"/>
-        <w:bidi w:val="0"/>
-        <w:jc w:val="start"/>
-        <w:rPr/>
+        <w:t># CONSUMER PROPERTY</w:t>
+      </w:r>
+    </w:p>
+    <w:p>
+      <w:pPr>
+        <w:pStyle w:val="BodyText"/>
+        <w:widowControl/>
+        <w:suppressAutoHyphens w:val="true"/>
+        <w:bidi w:val="0"/>
+        <w:spacing w:lineRule="auto" w:line="276" w:before="0" w:after="140"/>
+        <w:jc w:val="start"/>
+        <w:rPr>
+          <w:rFonts w:ascii="Liberation Sans" w:hAnsi="Liberation Sans" w:eastAsia="Noto Serif CJK SC" w:cs="FreeSans"/>
+          <w:b w:val="false"/>
+          <w:bCs w:val="false"/>
+          <w:i w:val="false"/>
+          <w:i w:val="false"/>
+          <w:caps w:val="false"/>
+          <w:smallCaps w:val="false"/>
+          <w:color w:val="000000"/>
+          <w:spacing w:val="0"/>
+          <w:kern w:val="2"/>
+          <w:sz w:val="24"/>
+          <w:szCs w:val="24"/>
+          <w:u w:val="none"/>
+          <w:lang w:val="en-IN" w:eastAsia="zh-CN" w:bidi="hi-IN"/>
+        </w:rPr>
       </w:pPr>
       <w:r>
         <w:rPr>
@@ -11777,8 +11890,18 @@
           <w:u w:val="none"/>
           <w:lang w:val="en-IN" w:eastAsia="zh-CN" w:bidi="hi-IN"/>
         </w:rPr>
-        <w:t>kafka-console-producer.sh --topic &lt;</w:t>
-      </w:r>
+        <w:t>kafka-console-consumer.sh --bootstrap-server &lt;broker_address:port&gt; --topic &lt;topic_name&gt; --formatter org.apache.kafka.tools.consumer.DefaultMessageFormatter --property print.timestamp=true --property print.key=true --property print.value=true --property print.partition=true –from-beginning</w:t>
+      </w:r>
+    </w:p>
+    <w:p>
+      <w:pPr>
+        <w:pStyle w:val="BodyText"/>
+        <w:widowControl/>
+        <w:suppressAutoHyphens w:val="true"/>
+        <w:bidi w:val="0"/>
+        <w:jc w:val="start"/>
+        <w:rPr/>
+      </w:pPr>
       <w:r>
         <w:rPr>
           <w:rStyle w:val="SourceText"/>
@@ -11796,8 +11919,18 @@
           <w:u w:val="none"/>
           <w:lang w:val="en-IN" w:eastAsia="zh-CN" w:bidi="hi-IN"/>
         </w:rPr>
-        <w:t>topic_name&gt;</w:t>
-      </w:r>
+        <w:t># ROUND ROBIN PARTITION</w:t>
+      </w:r>
+    </w:p>
+    <w:p>
+      <w:pPr>
+        <w:pStyle w:val="BodyText"/>
+        <w:widowControl/>
+        <w:suppressAutoHyphens w:val="true"/>
+        <w:bidi w:val="0"/>
+        <w:jc w:val="start"/>
+        <w:rPr/>
+      </w:pPr>
       <w:r>
         <w:rPr>
           <w:rStyle w:val="SourceText"/>
@@ -11815,8 +11948,34 @@
           <w:u w:val="none"/>
           <w:lang w:val="en-IN" w:eastAsia="zh-CN" w:bidi="hi-IN"/>
         </w:rPr>
-        <w:t xml:space="preserve"> --property parse.key=true --property key.separator=&lt;</w:t>
-      </w:r>
+        <w:t>kafka-console-producer.sh --bootstrap-server &lt;broker_address:port&gt; --topic &lt;topic_name&gt; --producer-property partitioner.class=org.apache.kafka.clients.producer.RoundRobinPartitioner</w:t>
+      </w:r>
+    </w:p>
+    <w:p>
+      <w:pPr>
+        <w:pStyle w:val="BodyText"/>
+        <w:widowControl/>
+        <w:suppressAutoHyphens w:val="true"/>
+        <w:bidi w:val="0"/>
+        <w:spacing w:lineRule="auto" w:line="276" w:before="0" w:after="140"/>
+        <w:jc w:val="start"/>
+        <w:rPr>
+          <w:rFonts w:ascii="Liberation Sans" w:hAnsi="Liberation Sans" w:eastAsia="Noto Serif CJK SC" w:cs="FreeSans"/>
+          <w:b w:val="false"/>
+          <w:bCs w:val="false"/>
+          <w:i w:val="false"/>
+          <w:i w:val="false"/>
+          <w:caps w:val="false"/>
+          <w:smallCaps w:val="false"/>
+          <w:color w:val="000000"/>
+          <w:spacing w:val="0"/>
+          <w:kern w:val="2"/>
+          <w:sz w:val="24"/>
+          <w:szCs w:val="24"/>
+          <w:u w:val="none"/>
+          <w:lang w:val="en-IN" w:eastAsia="zh-CN" w:bidi="hi-IN"/>
+        </w:rPr>
+      </w:pPr>
       <w:r>
         <w:rPr>
           <w:rStyle w:val="SourceText"/>
@@ -11834,8 +11993,34 @@
           <w:u w:val="none"/>
           <w:lang w:val="en-IN" w:eastAsia="zh-CN" w:bidi="hi-IN"/>
         </w:rPr>
-        <w:t>separator_symbol&gt;</w:t>
-      </w:r>
+        <w:t># DESCRIBE THE TOPIC</w:t>
+      </w:r>
+    </w:p>
+    <w:p>
+      <w:pPr>
+        <w:pStyle w:val="BodyText"/>
+        <w:widowControl/>
+        <w:suppressAutoHyphens w:val="true"/>
+        <w:bidi w:val="0"/>
+        <w:spacing w:lineRule="auto" w:line="276" w:before="0" w:after="140"/>
+        <w:jc w:val="start"/>
+        <w:rPr>
+          <w:rFonts w:ascii="Liberation Sans" w:hAnsi="Liberation Sans" w:eastAsia="Noto Serif CJK SC" w:cs="FreeSans"/>
+          <w:b w:val="false"/>
+          <w:bCs w:val="false"/>
+          <w:i w:val="false"/>
+          <w:i w:val="false"/>
+          <w:caps w:val="false"/>
+          <w:smallCaps w:val="false"/>
+          <w:color w:val="000000"/>
+          <w:spacing w:val="0"/>
+          <w:kern w:val="2"/>
+          <w:sz w:val="24"/>
+          <w:szCs w:val="24"/>
+          <w:u w:val="none"/>
+          <w:lang w:val="en-IN" w:eastAsia="zh-CN" w:bidi="hi-IN"/>
+        </w:rPr>
+      </w:pPr>
       <w:r>
         <w:rPr>
           <w:rStyle w:val="SourceText"/>
@@ -11853,17 +12038,33 @@
           <w:u w:val="none"/>
           <w:lang w:val="en-IN" w:eastAsia="zh-CN" w:bidi="hi-IN"/>
         </w:rPr>
-        <w:t xml:space="preserve"> --bootstrap-server &lt;broker_address:port&gt;</w:t>
-      </w:r>
-    </w:p>
-    <w:p>
-      <w:pPr>
-        <w:pStyle w:val="BodyText"/>
-        <w:widowControl/>
-        <w:suppressAutoHyphens w:val="true"/>
-        <w:bidi w:val="0"/>
-        <w:jc w:val="start"/>
-        <w:rPr/>
+        <w:t>kafka-topics.sh --bootstrap-server &lt;broker_address:port&gt; --describe --topic &lt;topic_name&gt;</w:t>
+      </w:r>
+    </w:p>
+    <w:p>
+      <w:pPr>
+        <w:pStyle w:val="BodyText"/>
+        <w:widowControl/>
+        <w:suppressAutoHyphens w:val="true"/>
+        <w:bidi w:val="0"/>
+        <w:spacing w:lineRule="auto" w:line="276" w:before="0" w:after="140"/>
+        <w:jc w:val="start"/>
+        <w:rPr>
+          <w:rFonts w:ascii="Liberation Sans" w:hAnsi="Liberation Sans" w:eastAsia="Noto Serif CJK SC" w:cs="FreeSans"/>
+          <w:b w:val="false"/>
+          <w:bCs w:val="false"/>
+          <w:i w:val="false"/>
+          <w:i w:val="false"/>
+          <w:caps w:val="false"/>
+          <w:smallCaps w:val="false"/>
+          <w:color w:val="000000"/>
+          <w:spacing w:val="0"/>
+          <w:kern w:val="2"/>
+          <w:sz w:val="24"/>
+          <w:szCs w:val="24"/>
+          <w:u w:val="none"/>
+          <w:lang w:val="en-IN" w:eastAsia="zh-CN" w:bidi="hi-IN"/>
+        </w:rPr>
       </w:pPr>
       <w:r>
         <w:rPr>
@@ -11882,8 +12083,34 @@
           <w:u w:val="none"/>
           <w:lang w:val="en-IN" w:eastAsia="zh-CN" w:bidi="hi-IN"/>
         </w:rPr>
-        <w:t xml:space="preserve">Example - </w:t>
-      </w:r>
+        <w:t># DELETE A TOPIC</w:t>
+      </w:r>
+    </w:p>
+    <w:p>
+      <w:pPr>
+        <w:pStyle w:val="BodyText"/>
+        <w:widowControl/>
+        <w:suppressAutoHyphens w:val="true"/>
+        <w:bidi w:val="0"/>
+        <w:spacing w:lineRule="auto" w:line="276" w:before="0" w:after="140"/>
+        <w:jc w:val="start"/>
+        <w:rPr>
+          <w:rFonts w:ascii="Liberation Sans" w:hAnsi="Liberation Sans" w:eastAsia="Noto Serif CJK SC" w:cs="FreeSans"/>
+          <w:b w:val="false"/>
+          <w:bCs w:val="false"/>
+          <w:i w:val="false"/>
+          <w:i w:val="false"/>
+          <w:caps w:val="false"/>
+          <w:smallCaps w:val="false"/>
+          <w:color w:val="000000"/>
+          <w:spacing w:val="0"/>
+          <w:kern w:val="2"/>
+          <w:sz w:val="24"/>
+          <w:szCs w:val="24"/>
+          <w:u w:val="none"/>
+          <w:lang w:val="en-IN" w:eastAsia="zh-CN" w:bidi="hi-IN"/>
+        </w:rPr>
+      </w:pPr>
       <w:r>
         <w:rPr>
           <w:rStyle w:val="SourceText"/>
@@ -11901,511 +12128,16 @@
           <w:u w:val="none"/>
           <w:lang w:val="en-IN" w:eastAsia="zh-CN" w:bidi="hi-IN"/>
         </w:rPr>
-        <w:t xml:space="preserve">kafka-console-producer.sh --topic </w:t>
-      </w:r>
-      <w:r>
-        <w:rPr>
-          <w:rStyle w:val="SourceText"/>
-          <w:rFonts w:eastAsia="Noto Serif CJK SC" w:cs="FreeSans" w:ascii="FreeMono" w:hAnsi="FreeMono"/>
-          <w:b w:val="false"/>
-          <w:bCs w:val="false"/>
-          <w:i w:val="false"/>
-          <w:caps w:val="false"/>
-          <w:smallCaps w:val="false"/>
-          <w:color w:val="000000"/>
-          <w:spacing w:val="0"/>
-          <w:kern w:val="2"/>
-          <w:sz w:val="24"/>
-          <w:szCs w:val="24"/>
-          <w:u w:val="none"/>
-          <w:lang w:val="en-IN" w:eastAsia="zh-CN" w:bidi="hi-IN"/>
-        </w:rPr>
-        <w:t>first_topic</w:t>
-      </w:r>
-      <w:r>
-        <w:rPr>
-          <w:rStyle w:val="SourceText"/>
-          <w:rFonts w:eastAsia="Noto Serif CJK SC" w:cs="FreeSans" w:ascii="FreeMono" w:hAnsi="FreeMono"/>
-          <w:b w:val="false"/>
-          <w:bCs w:val="false"/>
-          <w:i w:val="false"/>
-          <w:caps w:val="false"/>
-          <w:smallCaps w:val="false"/>
-          <w:color w:val="000000"/>
-          <w:spacing w:val="0"/>
-          <w:kern w:val="2"/>
-          <w:sz w:val="24"/>
-          <w:szCs w:val="24"/>
-          <w:u w:val="none"/>
-          <w:lang w:val="en-IN" w:eastAsia="zh-CN" w:bidi="hi-IN"/>
-        </w:rPr>
-        <w:t xml:space="preserve"> --property parse.key=true --property key.separator=: --bootstrap-server </w:t>
-      </w:r>
-      <w:r>
-        <w:rPr>
-          <w:rStyle w:val="SourceText"/>
-          <w:rFonts w:eastAsia="Noto Serif CJK SC" w:cs="FreeSans" w:ascii="FreeMono" w:hAnsi="FreeMono"/>
-          <w:b w:val="false"/>
-          <w:bCs w:val="false"/>
-          <w:i w:val="false"/>
-          <w:caps w:val="false"/>
-          <w:smallCaps w:val="false"/>
-          <w:color w:val="000000"/>
-          <w:spacing w:val="0"/>
-          <w:kern w:val="2"/>
-          <w:sz w:val="24"/>
-          <w:szCs w:val="24"/>
-          <w:u w:val="none"/>
-          <w:lang w:val="en-IN" w:eastAsia="zh-CN" w:bidi="hi-IN"/>
-        </w:rPr>
-        <w:t>localhost</w:t>
-      </w:r>
-      <w:r>
-        <w:rPr>
-          <w:rStyle w:val="SourceText"/>
-          <w:rFonts w:eastAsia="Noto Serif CJK SC" w:cs="FreeSans" w:ascii="FreeMono" w:hAnsi="FreeMono"/>
-          <w:b w:val="false"/>
-          <w:bCs w:val="false"/>
-          <w:i w:val="false"/>
-          <w:caps w:val="false"/>
-          <w:smallCaps w:val="false"/>
-          <w:color w:val="000000"/>
-          <w:spacing w:val="0"/>
-          <w:kern w:val="2"/>
-          <w:sz w:val="24"/>
-          <w:szCs w:val="24"/>
-          <w:u w:val="none"/>
-          <w:lang w:val="en-IN" w:eastAsia="zh-CN" w:bidi="hi-IN"/>
-        </w:rPr>
-        <w:t>:</w:t>
-      </w:r>
-      <w:r>
-        <w:rPr>
-          <w:rStyle w:val="SourceText"/>
-          <w:rFonts w:eastAsia="Noto Serif CJK SC" w:cs="FreeSans" w:ascii="FreeMono" w:hAnsi="FreeMono"/>
-          <w:b w:val="false"/>
-          <w:bCs w:val="false"/>
-          <w:i w:val="false"/>
-          <w:caps w:val="false"/>
-          <w:smallCaps w:val="false"/>
-          <w:color w:val="000000"/>
-          <w:spacing w:val="0"/>
-          <w:kern w:val="2"/>
-          <w:sz w:val="24"/>
-          <w:szCs w:val="24"/>
-          <w:u w:val="none"/>
-          <w:lang w:val="en-IN" w:eastAsia="zh-CN" w:bidi="hi-IN"/>
-        </w:rPr>
-        <w:t>9092</w:t>
-      </w:r>
-    </w:p>
-    <w:p>
-      <w:pPr>
-        <w:pStyle w:val="BodyText"/>
-        <w:widowControl/>
-        <w:suppressAutoHyphens w:val="true"/>
-        <w:bidi w:val="0"/>
-        <w:jc w:val="start"/>
-        <w:rPr/>
-      </w:pPr>
-      <w:r>
-        <w:rPr>
-          <w:rStyle w:val="SourceText"/>
-          <w:rFonts w:eastAsia="Noto Serif CJK SC" w:cs="FreeSans" w:ascii="FreeMono" w:hAnsi="FreeMono"/>
-          <w:b w:val="false"/>
-          <w:bCs w:val="false"/>
-          <w:i w:val="false"/>
-          <w:caps w:val="false"/>
-          <w:smallCaps w:val="false"/>
-          <w:color w:val="000000"/>
-          <w:spacing w:val="0"/>
-          <w:kern w:val="2"/>
-          <w:sz w:val="24"/>
-          <w:szCs w:val="24"/>
-          <w:u w:val="none"/>
-          <w:lang w:val="en-IN" w:eastAsia="zh-CN" w:bidi="hi-IN"/>
-        </w:rPr>
-        <w:t>&gt;example key:example value</w:t>
-      </w:r>
-    </w:p>
-    <w:p>
-      <w:pPr>
-        <w:pStyle w:val="BodyText"/>
-        <w:widowControl/>
-        <w:suppressAutoHyphens w:val="true"/>
-        <w:bidi w:val="0"/>
-        <w:jc w:val="start"/>
-        <w:rPr/>
-      </w:pPr>
-      <w:r>
-        <w:rPr>
-          <w:rStyle w:val="SourceText"/>
-          <w:rFonts w:eastAsia="Noto Serif CJK SC" w:cs="FreeSans" w:ascii="FreeMono" w:hAnsi="FreeMono"/>
-          <w:b w:val="false"/>
-          <w:bCs w:val="false"/>
-          <w:i w:val="false"/>
-          <w:caps w:val="false"/>
-          <w:smallCaps w:val="false"/>
-          <w:color w:val="000000"/>
-          <w:spacing w:val="0"/>
-          <w:kern w:val="2"/>
-          <w:sz w:val="24"/>
-          <w:szCs w:val="24"/>
-          <w:u w:val="none"/>
-          <w:lang w:val="en-IN" w:eastAsia="zh-CN" w:bidi="hi-IN"/>
-        </w:rPr>
-        <w:t>&gt;name:Stephane</w:t>
-      </w:r>
-    </w:p>
-    <w:p>
-      <w:pPr>
-        <w:pStyle w:val="BodyText"/>
-        <w:widowControl/>
-        <w:suppressAutoHyphens w:val="true"/>
-        <w:bidi w:val="0"/>
-        <w:spacing w:lineRule="auto" w:line="276" w:before="0" w:after="140"/>
-        <w:jc w:val="start"/>
-        <w:rPr>
-          <w:rFonts w:ascii="Liberation Sans" w:hAnsi="Liberation Sans" w:eastAsia="Noto Serif CJK SC" w:cs="FreeSans"/>
-          <w:b w:val="false"/>
-          <w:bCs w:val="false"/>
-          <w:i w:val="false"/>
-          <w:i w:val="false"/>
-          <w:caps w:val="false"/>
-          <w:smallCaps w:val="false"/>
-          <w:color w:val="000000"/>
-          <w:spacing w:val="0"/>
-          <w:kern w:val="2"/>
-          <w:sz w:val="24"/>
-          <w:szCs w:val="24"/>
-          <w:u w:val="none"/>
-          <w:lang w:val="en-IN" w:eastAsia="zh-CN" w:bidi="hi-IN"/>
-        </w:rPr>
-      </w:pPr>
-      <w:r>
-        <w:rPr>
-          <w:rStyle w:val="SourceText"/>
-          <w:rFonts w:eastAsia="Noto Serif CJK SC" w:cs="FreeSans" w:ascii="FreeMono" w:hAnsi="FreeMono"/>
-          <w:b w:val="false"/>
-          <w:bCs w:val="false"/>
-          <w:i w:val="false"/>
-          <w:caps w:val="false"/>
-          <w:smallCaps w:val="false"/>
-          <w:color w:val="000000"/>
-          <w:spacing w:val="0"/>
-          <w:kern w:val="2"/>
-          <w:sz w:val="24"/>
-          <w:szCs w:val="24"/>
-          <w:u w:val="none"/>
-          <w:lang w:val="en-IN" w:eastAsia="zh-CN" w:bidi="hi-IN"/>
-        </w:rPr>
-        <w:t># CONSUMER PROPERTY</w:t>
-      </w:r>
-    </w:p>
-    <w:p>
-      <w:pPr>
-        <w:pStyle w:val="BodyText"/>
-        <w:widowControl/>
-        <w:suppressAutoHyphens w:val="true"/>
-        <w:bidi w:val="0"/>
-        <w:spacing w:lineRule="auto" w:line="276" w:before="0" w:after="140"/>
-        <w:jc w:val="start"/>
-        <w:rPr>
-          <w:rFonts w:ascii="Liberation Sans" w:hAnsi="Liberation Sans" w:eastAsia="Noto Serif CJK SC" w:cs="FreeSans"/>
-          <w:b w:val="false"/>
-          <w:bCs w:val="false"/>
-          <w:i w:val="false"/>
-          <w:i w:val="false"/>
-          <w:caps w:val="false"/>
-          <w:smallCaps w:val="false"/>
-          <w:color w:val="000000"/>
-          <w:spacing w:val="0"/>
-          <w:kern w:val="2"/>
-          <w:sz w:val="24"/>
-          <w:szCs w:val="24"/>
-          <w:u w:val="none"/>
-          <w:lang w:val="en-IN" w:eastAsia="zh-CN" w:bidi="hi-IN"/>
-        </w:rPr>
-      </w:pPr>
-      <w:r>
-        <w:rPr>
-          <w:rStyle w:val="SourceText"/>
-          <w:rFonts w:eastAsia="Noto Serif CJK SC" w:cs="FreeSans" w:ascii="FreeMono" w:hAnsi="FreeMono"/>
-          <w:b w:val="false"/>
-          <w:bCs w:val="false"/>
-          <w:i w:val="false"/>
-          <w:caps w:val="false"/>
-          <w:smallCaps w:val="false"/>
-          <w:color w:val="000000"/>
-          <w:spacing w:val="0"/>
-          <w:kern w:val="2"/>
-          <w:sz w:val="24"/>
-          <w:szCs w:val="24"/>
-          <w:u w:val="none"/>
-          <w:lang w:val="en-IN" w:eastAsia="zh-CN" w:bidi="hi-IN"/>
-        </w:rPr>
-        <w:t>kafka-console-consumer.sh --bootstrap-server localhost:9092 --topic new_topic_2 --formatter org.apache.kafka.tools.consumer.DefaultMessageFormatter --property print.timestamp=true --property print.key=true --property print.value=true --property print.partition=true --from-beginning</w:t>
-      </w:r>
-    </w:p>
-    <w:p>
-      <w:pPr>
-        <w:pStyle w:val="BodyText"/>
-        <w:widowControl/>
-        <w:suppressAutoHyphens w:val="true"/>
-        <w:bidi w:val="0"/>
-        <w:spacing w:lineRule="auto" w:line="276" w:before="0" w:after="140"/>
-        <w:jc w:val="start"/>
-        <w:rPr>
-          <w:rFonts w:ascii="Liberation Sans" w:hAnsi="Liberation Sans" w:eastAsia="Noto Serif CJK SC" w:cs="FreeSans"/>
-          <w:b w:val="false"/>
-          <w:bCs w:val="false"/>
-          <w:i w:val="false"/>
-          <w:i w:val="false"/>
-          <w:caps w:val="false"/>
-          <w:smallCaps w:val="false"/>
-          <w:color w:val="000000"/>
-          <w:spacing w:val="0"/>
-          <w:kern w:val="2"/>
-          <w:sz w:val="24"/>
-          <w:szCs w:val="24"/>
-          <w:u w:val="none"/>
-          <w:lang w:val="en-IN" w:eastAsia="zh-CN" w:bidi="hi-IN"/>
-        </w:rPr>
-      </w:pPr>
-      <w:r>
-        <w:rPr>
-          <w:rStyle w:val="SourceText"/>
-          <w:rFonts w:eastAsia="Noto Serif CJK SC" w:cs="FreeSans" w:ascii="FreeMono" w:hAnsi="FreeMono"/>
-          <w:b w:val="false"/>
-          <w:bCs w:val="false"/>
-          <w:i w:val="false"/>
-          <w:caps w:val="false"/>
-          <w:smallCaps w:val="false"/>
-          <w:color w:val="000000"/>
-          <w:spacing w:val="0"/>
-          <w:kern w:val="2"/>
-          <w:sz w:val="24"/>
-          <w:szCs w:val="24"/>
-          <w:u w:val="none"/>
-          <w:lang w:val="en-IN" w:eastAsia="zh-CN" w:bidi="hi-IN"/>
-        </w:rPr>
-        <w:t># DESCRIBE THE TOPIC</w:t>
-      </w:r>
-    </w:p>
-    <w:p>
-      <w:pPr>
-        <w:pStyle w:val="BodyText"/>
-        <w:widowControl/>
-        <w:suppressAutoHyphens w:val="true"/>
-        <w:bidi w:val="0"/>
-        <w:spacing w:lineRule="auto" w:line="276" w:before="0" w:after="140"/>
-        <w:jc w:val="start"/>
-        <w:rPr>
-          <w:rFonts w:ascii="Liberation Sans" w:hAnsi="Liberation Sans" w:eastAsia="Noto Serif CJK SC" w:cs="FreeSans"/>
-          <w:b w:val="false"/>
-          <w:bCs w:val="false"/>
-          <w:i w:val="false"/>
-          <w:i w:val="false"/>
-          <w:caps w:val="false"/>
-          <w:smallCaps w:val="false"/>
-          <w:color w:val="000000"/>
-          <w:spacing w:val="0"/>
-          <w:kern w:val="2"/>
-          <w:sz w:val="24"/>
-          <w:szCs w:val="24"/>
-          <w:u w:val="none"/>
-          <w:lang w:val="en-IN" w:eastAsia="zh-CN" w:bidi="hi-IN"/>
-        </w:rPr>
-      </w:pPr>
-      <w:r>
-        <w:rPr>
-          <w:rStyle w:val="SourceText"/>
-          <w:rFonts w:eastAsia="Noto Serif CJK SC" w:cs="FreeSans" w:ascii="FreeMono" w:hAnsi="FreeMono"/>
-          <w:b w:val="false"/>
-          <w:bCs w:val="false"/>
-          <w:i w:val="false"/>
-          <w:caps w:val="false"/>
-          <w:smallCaps w:val="false"/>
-          <w:color w:val="000000"/>
-          <w:spacing w:val="0"/>
-          <w:kern w:val="2"/>
-          <w:sz w:val="24"/>
-          <w:szCs w:val="24"/>
-          <w:u w:val="none"/>
-          <w:lang w:val="en-IN" w:eastAsia="zh-CN" w:bidi="hi-IN"/>
-        </w:rPr>
-        <w:t>kafka-topics.sh --</w:t>
-      </w:r>
-      <w:r>
-        <w:rPr>
-          <w:rStyle w:val="SourceText"/>
-          <w:rFonts w:eastAsia="Noto Serif CJK SC" w:cs="FreeSans" w:ascii="FreeMono" w:hAnsi="FreeMono"/>
-          <w:b w:val="false"/>
-          <w:bCs w:val="false"/>
-          <w:i w:val="false"/>
-          <w:caps w:val="false"/>
-          <w:smallCaps w:val="false"/>
-          <w:color w:val="000000"/>
-          <w:spacing w:val="0"/>
-          <w:kern w:val="2"/>
-          <w:sz w:val="24"/>
-          <w:szCs w:val="24"/>
-          <w:u w:val="none"/>
-          <w:lang w:val="en-IN" w:eastAsia="zh-CN" w:bidi="hi-IN"/>
-        </w:rPr>
-        <w:t>describe</w:t>
-      </w:r>
-      <w:r>
-        <w:rPr>
-          <w:rStyle w:val="SourceText"/>
-          <w:rFonts w:eastAsia="Noto Serif CJK SC" w:cs="FreeSans" w:ascii="FreeMono" w:hAnsi="FreeMono"/>
-          <w:b w:val="false"/>
-          <w:bCs w:val="false"/>
-          <w:i w:val="false"/>
-          <w:caps w:val="false"/>
-          <w:smallCaps w:val="false"/>
-          <w:color w:val="000000"/>
-          <w:spacing w:val="0"/>
-          <w:kern w:val="2"/>
-          <w:sz w:val="24"/>
-          <w:szCs w:val="24"/>
-          <w:u w:val="none"/>
-          <w:lang w:val="en-IN" w:eastAsia="zh-CN" w:bidi="hi-IN"/>
-        </w:rPr>
-        <w:t xml:space="preserve"> --topic &lt;topic_name&gt; --bootstrap-server &lt;broker_address:port&gt;</w:t>
-      </w:r>
-    </w:p>
-    <w:p>
-      <w:pPr>
-        <w:pStyle w:val="BodyText"/>
-        <w:widowControl/>
-        <w:suppressAutoHyphens w:val="true"/>
-        <w:bidi w:val="0"/>
-        <w:spacing w:lineRule="auto" w:line="276" w:before="0" w:after="140"/>
-        <w:jc w:val="start"/>
-        <w:rPr>
-          <w:rFonts w:ascii="Liberation Sans" w:hAnsi="Liberation Sans" w:eastAsia="Noto Serif CJK SC" w:cs="FreeSans"/>
-          <w:b w:val="false"/>
-          <w:bCs w:val="false"/>
-          <w:i w:val="false"/>
-          <w:i w:val="false"/>
-          <w:caps w:val="false"/>
-          <w:smallCaps w:val="false"/>
-          <w:color w:val="000000"/>
-          <w:spacing w:val="0"/>
-          <w:kern w:val="2"/>
-          <w:sz w:val="24"/>
-          <w:szCs w:val="24"/>
-          <w:u w:val="none"/>
-          <w:lang w:val="en-IN" w:eastAsia="zh-CN" w:bidi="hi-IN"/>
-        </w:rPr>
-      </w:pPr>
-      <w:r>
-        <w:rPr>
-          <w:rStyle w:val="SourceText"/>
-          <w:rFonts w:eastAsia="Noto Serif CJK SC" w:cs="FreeSans" w:ascii="FreeMono" w:hAnsi="FreeMono"/>
-          <w:b w:val="false"/>
-          <w:bCs w:val="false"/>
-          <w:i w:val="false"/>
-          <w:caps w:val="false"/>
-          <w:smallCaps w:val="false"/>
-          <w:color w:val="000000"/>
-          <w:spacing w:val="0"/>
-          <w:kern w:val="2"/>
-          <w:sz w:val="24"/>
-          <w:szCs w:val="24"/>
-          <w:u w:val="none"/>
-          <w:lang w:val="en-IN" w:eastAsia="zh-CN" w:bidi="hi-IN"/>
-        </w:rPr>
-        <w:t># DELETE A TOPIC</w:t>
-      </w:r>
-    </w:p>
-    <w:p>
-      <w:pPr>
-        <w:pStyle w:val="BodyText"/>
-        <w:widowControl/>
-        <w:suppressAutoHyphens w:val="true"/>
-        <w:bidi w:val="0"/>
-        <w:spacing w:lineRule="auto" w:line="276" w:before="0" w:after="140"/>
-        <w:jc w:val="start"/>
-        <w:rPr>
-          <w:rFonts w:ascii="Liberation Sans" w:hAnsi="Liberation Sans" w:eastAsia="Noto Serif CJK SC" w:cs="FreeSans"/>
-          <w:b w:val="false"/>
-          <w:bCs w:val="false"/>
-          <w:i w:val="false"/>
-          <w:i w:val="false"/>
-          <w:caps w:val="false"/>
-          <w:smallCaps w:val="false"/>
-          <w:color w:val="000000"/>
-          <w:spacing w:val="0"/>
-          <w:kern w:val="2"/>
-          <w:sz w:val="24"/>
-          <w:szCs w:val="24"/>
-          <w:u w:val="none"/>
-          <w:lang w:val="en-IN" w:eastAsia="zh-CN" w:bidi="hi-IN"/>
-        </w:rPr>
-      </w:pPr>
-      <w:r>
-        <w:rPr>
-          <w:rStyle w:val="SourceText"/>
-          <w:rFonts w:eastAsia="Noto Serif CJK SC" w:cs="FreeSans" w:ascii="FreeMono" w:hAnsi="FreeMono"/>
-          <w:b w:val="false"/>
-          <w:bCs w:val="false"/>
-          <w:i w:val="false"/>
-          <w:caps w:val="false"/>
-          <w:smallCaps w:val="false"/>
-          <w:color w:val="000000"/>
-          <w:spacing w:val="0"/>
-          <w:kern w:val="2"/>
-          <w:sz w:val="24"/>
-          <w:szCs w:val="24"/>
-          <w:u w:val="none"/>
-          <w:lang w:val="en-IN" w:eastAsia="zh-CN" w:bidi="hi-IN"/>
-        </w:rPr>
-        <w:t>kafka-topics.sh --</w:t>
-      </w:r>
-      <w:r>
-        <w:rPr>
-          <w:rStyle w:val="SourceText"/>
-          <w:rFonts w:eastAsia="Noto Serif CJK SC" w:cs="FreeSans" w:ascii="FreeMono" w:hAnsi="FreeMono"/>
-          <w:b w:val="false"/>
-          <w:bCs w:val="false"/>
-          <w:i w:val="false"/>
-          <w:caps w:val="false"/>
-          <w:smallCaps w:val="false"/>
-          <w:color w:val="000000"/>
-          <w:spacing w:val="0"/>
-          <w:kern w:val="2"/>
-          <w:sz w:val="24"/>
-          <w:szCs w:val="24"/>
-          <w:u w:val="none"/>
-          <w:lang w:val="en-IN" w:eastAsia="zh-CN" w:bidi="hi-IN"/>
-        </w:rPr>
-        <w:t>delete</w:t>
-      </w:r>
-      <w:r>
-        <w:rPr>
-          <w:rStyle w:val="SourceText"/>
-          <w:rFonts w:eastAsia="Noto Serif CJK SC" w:cs="FreeSans" w:ascii="FreeMono" w:hAnsi="FreeMono"/>
-          <w:b w:val="false"/>
-          <w:bCs w:val="false"/>
-          <w:i w:val="false"/>
-          <w:caps w:val="false"/>
-          <w:smallCaps w:val="false"/>
-          <w:color w:val="000000"/>
-          <w:spacing w:val="0"/>
-          <w:kern w:val="2"/>
-          <w:sz w:val="24"/>
-          <w:szCs w:val="24"/>
-          <w:u w:val="none"/>
-          <w:lang w:val="en-IN" w:eastAsia="zh-CN" w:bidi="hi-IN"/>
-        </w:rPr>
-        <w:t xml:space="preserve"> --topic &lt;topic_name&gt; --bootstrap-server &lt;broker_address:port&gt;</w:t>
+        <w:t>kafka-topics.sh --bootstrap-server &lt;broker_address:port&gt; --delete --topic &lt;topic_name&gt;</w:t>
       </w:r>
     </w:p>
     <w:sectPr>
-      <w:headerReference w:type="default" r:id="rId7"/>
-      <w:footerReference w:type="default" r:id="rId8"/>
+      <w:headerReference w:type="even" r:id="rId7"/>
+      <w:headerReference w:type="default" r:id="rId8"/>
+      <w:headerReference w:type="first" r:id="rId9"/>
+      <w:footerReference w:type="even" r:id="rId10"/>
+      <w:footerReference w:type="default" r:id="rId11"/>
+      <w:footerReference w:type="first" r:id="rId12"/>
       <w:type w:val="nextPage"/>
       <w:pgSz w:w="11906" w:h="16838"/>
       <w:pgMar w:left="1134" w:right="1134" w:gutter="0" w:header="1134" w:top="1417" w:footer="1134" w:bottom="1693"/>
@@ -12419,6 +12151,20 @@
 </file>
 
 <file path=word/footer1.xml><?xml version="1.0" encoding="utf-8"?>
+<w:ftr xmlns:o="urn:schemas-microsoft-com:office:office" xmlns:r="http://schemas.openxmlformats.org/officeDocument/2006/relationships" xmlns:v="urn:schemas-microsoft-com:vml" xmlns:w="http://schemas.openxmlformats.org/wordprocessingml/2006/main" xmlns:w10="urn:schemas-microsoft-com:office:word" xmlns:wp="http://schemas.openxmlformats.org/drawingml/2006/wordprocessingDrawing" xmlns:wps="http://schemas.microsoft.com/office/word/2010/wordprocessingShape" xmlns:wpg="http://schemas.microsoft.com/office/word/2010/wordprocessingGroup" xmlns:mc="http://schemas.openxmlformats.org/markup-compatibility/2006" xmlns:wp14="http://schemas.microsoft.com/office/word/2010/wordprocessingDrawing" xmlns:w14="http://schemas.microsoft.com/office/word/2010/wordml" xmlns:w15="http://schemas.microsoft.com/office/word/2012/wordml" mc:Ignorable="w14 wp14 w15">
+  <w:p>
+    <w:pPr>
+      <w:pStyle w:val="Footer"/>
+      <w:rPr/>
+    </w:pPr>
+    <w:r>
+      <w:rPr/>
+    </w:r>
+  </w:p>
+</w:ftr>
+</file>
+
+<file path=word/footer2.xml><?xml version="1.0" encoding="utf-8"?>
 <w:ftr xmlns:o="urn:schemas-microsoft-com:office:office" xmlns:r="http://schemas.openxmlformats.org/officeDocument/2006/relationships" xmlns:v="urn:schemas-microsoft-com:vml" xmlns:w="http://schemas.openxmlformats.org/wordprocessingml/2006/main" xmlns:w10="urn:schemas-microsoft-com:office:word" xmlns:wp="http://schemas.openxmlformats.org/drawingml/2006/wordprocessingDrawing" xmlns:wps="http://schemas.microsoft.com/office/word/2010/wordprocessingShape" xmlns:wpg="http://schemas.microsoft.com/office/word/2010/wordprocessingGroup" xmlns:mc="http://schemas.openxmlformats.org/markup-compatibility/2006" xmlns:wp14="http://schemas.microsoft.com/office/word/2010/wordprocessingDrawing" xmlns:w14="http://schemas.microsoft.com/office/word/2010/wordml" xmlns:w15="http://schemas.microsoft.com/office/word/2012/wordml" mc:Ignorable="w14 wp14 w15">
   <w:p>
     <w:pPr>
@@ -12441,7 +12187,7 @@
     </w:r>
     <w:r>
       <w:rPr/>
-      <w:t>13</w:t>
+      <w:t>18</w:t>
     </w:r>
     <w:r>
       <w:rPr/>
@@ -12452,7 +12198,69 @@
 </w:ftr>
 </file>
 
+<file path=word/footer3.xml><?xml version="1.0" encoding="utf-8"?>
+<w:ftr xmlns:o="urn:schemas-microsoft-com:office:office" xmlns:r="http://schemas.openxmlformats.org/officeDocument/2006/relationships" xmlns:v="urn:schemas-microsoft-com:vml" xmlns:w="http://schemas.openxmlformats.org/wordprocessingml/2006/main" xmlns:w10="urn:schemas-microsoft-com:office:word" xmlns:wp="http://schemas.openxmlformats.org/drawingml/2006/wordprocessingDrawing" xmlns:wps="http://schemas.microsoft.com/office/word/2010/wordprocessingShape" xmlns:wpg="http://schemas.microsoft.com/office/word/2010/wordprocessingGroup" xmlns:mc="http://schemas.openxmlformats.org/markup-compatibility/2006" xmlns:wp14="http://schemas.microsoft.com/office/word/2010/wordprocessingDrawing" xmlns:w14="http://schemas.microsoft.com/office/word/2010/wordml" xmlns:w15="http://schemas.microsoft.com/office/word/2012/wordml" mc:Ignorable="w14 wp14 w15">
+  <w:p>
+    <w:pPr>
+      <w:pStyle w:val="Footer"/>
+      <w:jc w:val="center"/>
+      <w:rPr/>
+    </w:pPr>
+    <w:bookmarkStart w:id="46" w:name="PageNumWizard_FOOTER_Default_Page_Style1"/>
+    <w:r>
+      <w:rPr/>
+      <w:fldChar w:fldCharType="begin"/>
+    </w:r>
+    <w:r>
+      <w:rPr/>
+      <w:instrText xml:space="preserve"> PAGE </w:instrText>
+    </w:r>
+    <w:r>
+      <w:rPr/>
+      <w:fldChar w:fldCharType="separate"/>
+    </w:r>
+    <w:r>
+      <w:rPr/>
+      <w:t>18</w:t>
+    </w:r>
+    <w:r>
+      <w:rPr/>
+      <w:fldChar w:fldCharType="end"/>
+    </w:r>
+    <w:bookmarkEnd w:id="46"/>
+  </w:p>
+</w:ftr>
+</file>
+
 <file path=word/header1.xml><?xml version="1.0" encoding="utf-8"?>
+<w:hdr xmlns:o="urn:schemas-microsoft-com:office:office" xmlns:r="http://schemas.openxmlformats.org/officeDocument/2006/relationships" xmlns:v="urn:schemas-microsoft-com:vml" xmlns:w="http://schemas.openxmlformats.org/wordprocessingml/2006/main" xmlns:w10="urn:schemas-microsoft-com:office:word" xmlns:wp="http://schemas.openxmlformats.org/drawingml/2006/wordprocessingDrawing" xmlns:wps="http://schemas.microsoft.com/office/word/2010/wordprocessingShape" xmlns:wpg="http://schemas.microsoft.com/office/word/2010/wordprocessingGroup" xmlns:mc="http://schemas.openxmlformats.org/markup-compatibility/2006" xmlns:wp14="http://schemas.microsoft.com/office/word/2010/wordprocessingDrawing" xmlns:w14="http://schemas.microsoft.com/office/word/2010/wordml" xmlns:w15="http://schemas.microsoft.com/office/word/2012/wordml" mc:Ignorable="w14 wp14 w15">
+  <w:p>
+    <w:pPr>
+      <w:pStyle w:val="Header"/>
+      <w:rPr/>
+    </w:pPr>
+    <w:r>
+      <w:rPr/>
+    </w:r>
+  </w:p>
+</w:hdr>
+</file>
+
+<file path=word/header2.xml><?xml version="1.0" encoding="utf-8"?>
+<w:hdr xmlns:o="urn:schemas-microsoft-com:office:office" xmlns:r="http://schemas.openxmlformats.org/officeDocument/2006/relationships" xmlns:v="urn:schemas-microsoft-com:vml" xmlns:w="http://schemas.openxmlformats.org/wordprocessingml/2006/main" xmlns:w10="urn:schemas-microsoft-com:office:word" xmlns:wp="http://schemas.openxmlformats.org/drawingml/2006/wordprocessingDrawing" xmlns:wps="http://schemas.microsoft.com/office/word/2010/wordprocessingShape" xmlns:wpg="http://schemas.microsoft.com/office/word/2010/wordprocessingGroup" xmlns:mc="http://schemas.openxmlformats.org/markup-compatibility/2006" xmlns:wp14="http://schemas.microsoft.com/office/word/2010/wordprocessingDrawing" xmlns:w14="http://schemas.microsoft.com/office/word/2010/wordml" xmlns:w15="http://schemas.microsoft.com/office/word/2012/wordml" mc:Ignorable="w14 wp14 w15">
+  <w:p>
+    <w:pPr>
+      <w:pStyle w:val="Header"/>
+      <w:rPr/>
+    </w:pPr>
+    <w:r>
+      <w:rPr/>
+    </w:r>
+  </w:p>
+</w:hdr>
+</file>
+
+<file path=word/header3.xml><?xml version="1.0" encoding="utf-8"?>
 <w:hdr xmlns:o="urn:schemas-microsoft-com:office:office" xmlns:r="http://schemas.openxmlformats.org/officeDocument/2006/relationships" xmlns:v="urn:schemas-microsoft-com:vml" xmlns:w="http://schemas.openxmlformats.org/wordprocessingml/2006/main" xmlns:w10="urn:schemas-microsoft-com:office:word" xmlns:wp="http://schemas.openxmlformats.org/drawingml/2006/wordprocessingDrawing" xmlns:wps="http://schemas.microsoft.com/office/word/2010/wordprocessingShape" xmlns:wpg="http://schemas.microsoft.com/office/word/2010/wordprocessingGroup" xmlns:mc="http://schemas.openxmlformats.org/markup-compatibility/2006" xmlns:wp14="http://schemas.microsoft.com/office/word/2010/wordprocessingDrawing" xmlns:w14="http://schemas.microsoft.com/office/word/2010/wordml" xmlns:w15="http://schemas.microsoft.com/office/word/2012/wordml" mc:Ignorable="w14 wp14 w15">
   <w:p>
     <w:pPr>

</xml_diff>